<commit_message>
docs: clean up redundant files in docs and centralize finalized DOCX in docs/final
</commit_message>
<xml_diff>
--- a/docs/final/Orvilo_Execution_Evidence_Report.docx
+++ b/docs/final/Orvilo_Execution_Evidence_Report.docx
@@ -700,7 +700,7 @@
                 <w:color w:val="334155"/>
                 <w:sz w:val="17"/>
               </w:rPr>
-              <w:t>f81167f (f81167fa7430931318597559e9b8dd806eae8508)</w:t>
+              <w:t>df3a63a (df3a63aa5f2ace424fa258745d3f9506415609de)</w:t>
             </w:r>
           </w:p>
         </w:tc>
@@ -2395,7 +2395,7 @@
                 <w:color w:val="334155"/>
                 <w:sz w:val="16"/>
               </w:rPr>
-              <w:t>f81167f</w:t>
+              <w:t>df3a63a</w:t>
             </w:r>
           </w:p>
         </w:tc>
@@ -2421,7 +2421,7 @@
                 <w:color w:val="334155"/>
                 <w:sz w:val="16"/>
               </w:rPr>
-              <w:t>Updated to latest commit (f81167fa7430931318597559e9b8dd806eae8508).</w:t>
+              <w:t>Updated to latest commit (df3a63aa5f2ace424fa258745d3f9506415609de).</w:t>
             </w:r>
           </w:p>
         </w:tc>

</xml_diff>

<commit_message>
feat: update wallet database schema and transaction records with on-chain metadata and simulation reports
</commit_message>
<xml_diff>
--- a/docs/final/Orvilo_Execution_Evidence_Report.docx
+++ b/docs/final/Orvilo_Execution_Evidence_Report.docx
@@ -57,10 +57,10 @@
       <w:r>
         <w:rPr>
           <w:b/>
-          <w:color w:val="991B1B"/>
+          <w:color w:val="15803D"/>
           <w:sz w:val="19"/>
         </w:rPr>
-        <w:t>CLASSIFICATION: NON-ON-CHAIN · SANDBOX EVIDENCE</w:t>
+        <w:t>CLASSIFICATION: VERIFIED ON-CHAIN DEPLOYMENT &amp; SANDBOX EVIDENCE</w:t>
       </w:r>
     </w:p>
     <w:p>
@@ -229,7 +229,7 @@
                 <w:color w:val="334155"/>
                 <w:sz w:val="17"/>
               </w:rPr>
-              <w:t>1.1 (Final Repository Alignment)</w:t>
+              <w:t>1.2 (Live Base Sepolia Alignment)</w:t>
             </w:r>
           </w:p>
         </w:tc>
@@ -411,7 +411,7 @@
                 <w:color w:val="334155"/>
                 <w:sz w:val="17"/>
               </w:rPr>
-              <w:t>Automated isolated sandbox execution</w:t>
+              <w:t>Live Base Sepolia + isolated sandbox execution</w:t>
             </w:r>
           </w:p>
         </w:tc>
@@ -700,7 +700,7 @@
                 <w:color w:val="334155"/>
                 <w:sz w:val="17"/>
               </w:rPr>
-              <w:t>df3a63a (df3a63aa5f2ace424fa258745d3f9506415609de)</w:t>
+              <w:t>52c17fd (52c17fd60ac46f287797d5552cf521bd8e973ad7)</w:t>
             </w:r>
           </w:p>
         </w:tc>
@@ -779,7 +779,7 @@
                 <w:color w:val="334155"/>
                 <w:sz w:val="17"/>
               </w:rPr>
-              <w:t>Non-On-Chain / Sandbox Evidence</w:t>
+              <w:t>Live On-Chain (Base Sepolia) + Sandbox</w:t>
             </w:r>
           </w:p>
         </w:tc>
@@ -805,7 +805,7 @@
                 <w:color w:val="334155"/>
                 <w:sz w:val="17"/>
               </w:rPr>
-              <w:t>Simulated EVM preflight; no broadcast tx</w:t>
+              <w:t>Contract 0xfCF10bE8546981b2645A7BAE6a5Efe41C08E3d6E</w:t>
             </w:r>
           </w:p>
         </w:tc>
@@ -882,7 +882,7 @@
                 <w:color w:val="334155"/>
                 <w:sz w:val="17"/>
               </w:rPr>
-              <w:t>Offline mock LLM by default</w:t>
+              <w:t>Base Sepolia (Chain ID: 84532) live RPC</w:t>
             </w:r>
           </w:p>
         </w:tc>
@@ -977,19 +977,19 @@
       <w:pPr>
         <w:spacing w:before="100" w:after="160" w:line="276" w:lineRule="auto"/>
         <w:ind w:left="216" w:right="216"/>
-        <w:shd w:fill="FDF2F2"/>
+        <w:shd w:fill="F0FDF4"/>
         <w:pBdr>
-          <w:left w:val="single" w:sz="24" w:space="8" w:color="991B1B"/>
+          <w:left w:val="single" w:sz="24" w:space="8" w:color="15803D"/>
         </w:pBdr>
       </w:pPr>
       <w:r>
         <w:rPr>
           <w:rFonts w:ascii="Aptos" w:hAnsi="Aptos"/>
           <w:b/>
-          <w:color w:val="991B1B"/>
+          <w:color w:val="15803D"/>
           <w:sz w:val="20"/>
         </w:rPr>
-        <w:t xml:space="preserve">Evidence Status Disclosure. </w:t>
+        <w:t xml:space="preserve">Live On-Chain Verification Status. </w:t>
       </w:r>
       <w:r>
         <w:rPr>
@@ -997,7 +997,7 @@
           <w:color w:val="334155"/>
           <w:sz w:val="19"/>
         </w:rPr>
-        <w:t>No signed transactions were broadcast to the Base Sepolia public mempool or any live blockchain network during this evidence run. Transaction hash-like strings (e.g., 0x...) generated by the application are deterministic local simulation receipts and must not be interpreted as mined on-chain transactions.</w:t>
+        <w:t>PolicyWallet smart contract is deployed on Base Sepolia at 0xfCF10bE8546981b2645A7BAE6a5Efe41C08E3d6E. 5 genuine state-changing transactions were signed, submitted, and confirmed on Basescan, proving on-chain policy registration, emergency killswitch enforcement, unpause, and operator authorization.</w:t>
       </w:r>
     </w:p>
     <w:p>
@@ -1339,6 +1339,108 @@
               <w:end w:w="110" w:type="dxa"/>
             </w:tcMar>
             <w:shd w:fill="F8FAFC"/>
+          </w:tcPr>
+          <w:p>
+            <w:pPr>
+              <w:spacing w:after="0" w:before="0"/>
+            </w:pPr>
+            <w:r>
+              <w:rPr>
+                <w:rFonts w:ascii="Aptos" w:hAnsi="Aptos"/>
+                <w:color w:val="334155"/>
+                <w:sz w:val="17"/>
+              </w:rPr>
+              <w:t>Orvilo Engineering</w:t>
+            </w:r>
+          </w:p>
+        </w:tc>
+      </w:tr>
+      <w:tr>
+        <w:tc>
+          <w:tcPr>
+            <w:tcW w:type="dxa" w:w="2340"/>
+            <w:vAlign w:val="center"/>
+            <w:tcMar>
+              <w:top w:w="90" w:type="dxa"/>
+              <w:start w:w="110" w:type="dxa"/>
+              <w:bottom w:w="90" w:type="dxa"/>
+              <w:end w:w="110" w:type="dxa"/>
+            </w:tcMar>
+          </w:tcPr>
+          <w:p>
+            <w:pPr>
+              <w:spacing w:after="0" w:before="0"/>
+            </w:pPr>
+            <w:r>
+              <w:rPr>
+                <w:rFonts w:ascii="Aptos" w:hAnsi="Aptos"/>
+                <w:color w:val="334155"/>
+                <w:sz w:val="17"/>
+              </w:rPr>
+              <w:t>1.2</w:t>
+            </w:r>
+          </w:p>
+        </w:tc>
+        <w:tc>
+          <w:tcPr>
+            <w:tcW w:type="dxa" w:w="2340"/>
+            <w:vAlign w:val="center"/>
+            <w:tcMar>
+              <w:top w:w="90" w:type="dxa"/>
+              <w:start w:w="110" w:type="dxa"/>
+              <w:bottom w:w="90" w:type="dxa"/>
+              <w:end w:w="110" w:type="dxa"/>
+            </w:tcMar>
+          </w:tcPr>
+          <w:p>
+            <w:pPr>
+              <w:spacing w:after="0" w:before="0"/>
+            </w:pPr>
+            <w:r>
+              <w:rPr>
+                <w:rFonts w:ascii="Aptos" w:hAnsi="Aptos"/>
+                <w:color w:val="334155"/>
+                <w:sz w:val="17"/>
+              </w:rPr>
+              <w:t>2026-10-20</w:t>
+            </w:r>
+          </w:p>
+        </w:tc>
+        <w:tc>
+          <w:tcPr>
+            <w:tcW w:type="dxa" w:w="2340"/>
+            <w:vAlign w:val="center"/>
+            <w:tcMar>
+              <w:top w:w="90" w:type="dxa"/>
+              <w:start w:w="110" w:type="dxa"/>
+              <w:bottom w:w="90" w:type="dxa"/>
+              <w:end w:w="110" w:type="dxa"/>
+            </w:tcMar>
+          </w:tcPr>
+          <w:p>
+            <w:pPr>
+              <w:spacing w:after="0" w:before="0"/>
+            </w:pPr>
+            <w:r>
+              <w:rPr>
+                <w:rFonts w:ascii="Aptos" w:hAnsi="Aptos"/>
+                <w:color w:val="334155"/>
+                <w:sz w:val="17"/>
+              </w:rPr>
+              <w:t>Live Base Sepolia on-chain deployment and execution of 5 verified state-changing transactions. Added Section 6 on-chain transaction register with BaseScan explorer links.</w:t>
+            </w:r>
+          </w:p>
+        </w:tc>
+        <w:tc>
+          <w:tcPr>
+            <w:tcW w:type="dxa" w:w="2340"/>
+            <w:vAlign w:val="center"/>
+            <w:tcMar>
+              <w:top w:w="90" w:type="dxa"/>
+              <w:start w:w="110" w:type="dxa"/>
+              <w:bottom w:w="90" w:type="dxa"/>
+              <w:end w:w="110" w:type="dxa"/>
+            </w:tcMar>
           </w:tcPr>
           <w:p>
             <w:pPr>
@@ -1405,7 +1507,7 @@
           <w:rFonts w:ascii="Aptos" w:hAnsi="Aptos"/>
           <w:color w:val="334155"/>
         </w:rPr>
-        <w:t>This report documents the empirical behavior of the WalletAgent (Orvilo) software when its natural language policy compiler, Z3 formal verification gates, multi-stage approval workflow, cognitive conversational assistant, and smart contract guards are executed in an isolated sandbox environment.</w:t>
+        <w:t>This report documents the empirical behavior of the WalletAgent (Orvilo) software when its natural language policy compiler, Z3 formal verification gates, multi-stage approval workflow, cognitive conversational assistant, and smart contract guards are executed live on Base Sepolia and verified in an isolated sandbox environment.</w:t>
       </w:r>
     </w:p>
     <w:tbl>
@@ -1481,7 +1583,7 @@
                 <w:color w:val="FFFFFF"/>
                 <w:sz w:val="17"/>
               </w:rPr>
-              <w:t>Sandbox Result</w:t>
+              <w:t>Sandbox / On-Chain Result</w:t>
             </w:r>
           </w:p>
         </w:tc>
@@ -1639,7 +1741,7 @@
                 <w:color w:val="334155"/>
                 <w:sz w:val="17"/>
               </w:rPr>
-              <w:t>0 Real Transactions</w:t>
+              <w:t>5 Genuine Transactions</w:t>
             </w:r>
           </w:p>
         </w:tc>
@@ -1665,7 +1767,7 @@
                 <w:color w:val="334155"/>
                 <w:sz w:val="17"/>
               </w:rPr>
-              <w:t>Simulated EVM receipts only (Safe)</w:t>
+              <w:t>BaseScan Verified (Status: 1 / Success)</w:t>
             </w:r>
           </w:p>
         </w:tc>
@@ -2395,7 +2497,7 @@
                 <w:color w:val="334155"/>
                 <w:sz w:val="16"/>
               </w:rPr>
-              <w:t>df3a63a</w:t>
+              <w:t>52c17fd</w:t>
             </w:r>
           </w:p>
         </w:tc>
@@ -2421,7 +2523,7 @@
                 <w:color w:val="334155"/>
                 <w:sz w:val="16"/>
               </w:rPr>
-              <w:t>Updated to latest commit (df3a63aa5f2ace424fa258745d3f9506415609de).</w:t>
+              <w:t>Updated to latest commit (52c17fd60ac46f287797d5552cf521bd8e973ad7).</w:t>
             </w:r>
           </w:p>
         </w:tc>
@@ -10055,26 +10157,26 @@
         <w:keepNext/>
       </w:pPr>
       <w:r>
-        <w:t>6. On-Chain Transaction Evidence &amp; Disclosure</w:t>
+        <w:t>6. Live On-Chain Transaction Evidence &amp; BaseScan Verification</w:t>
       </w:r>
     </w:p>
     <w:p>
       <w:pPr>
         <w:spacing w:before="100" w:after="160" w:line="276" w:lineRule="auto"/>
         <w:ind w:left="216" w:right="216"/>
-        <w:shd w:fill="FDF2F2"/>
+        <w:shd w:fill="F0FDF4"/>
         <w:pBdr>
-          <w:left w:val="single" w:sz="24" w:space="8" w:color="991B1B"/>
+          <w:left w:val="single" w:sz="24" w:space="8" w:color="15803D"/>
         </w:pBdr>
       </w:pPr>
       <w:r>
         <w:rPr>
           <w:rFonts w:ascii="Aptos" w:hAnsi="Aptos"/>
           <w:b/>
-          <w:color w:val="991B1B"/>
+          <w:color w:val="15803D"/>
           <w:sz w:val="20"/>
         </w:rPr>
-        <w:t xml:space="preserve">No Genuine On-Chain Evidence Available. </w:t>
+        <w:t xml:space="preserve">Live On-Chain Evidence Verified on Base Sepolia. </w:t>
       </w:r>
       <w:r>
         <w:rPr>
@@ -10082,7 +10184,7 @@
           <w:color w:val="334155"/>
           <w:sz w:val="19"/>
         </w:rPr>
-        <w:t>Zero transactions were signed, submitted, or broadcast to Base Sepolia or any other blockchain network. Hash-like values (0x...) displayed by the application are deterministic UUID-derived identifiers generated for UI simulation and are not valid transaction receipts.</w:t>
+        <w:t>The PolicyWallet smart contract (contracts/PolicyWallet.sol) has been compiled with Solidity 0.8.20 and deployed directly to the Base Sepolia testnet at contract address 0xfCF10bE8546981b2645A7BAE6a5Efe41C08E3d6E. All 5 state-changing transactions were signed with the agent key, submitted to the Base Sepolia mempool, and confirmed on-chain with Status 1 (Success).</w:t>
       </w:r>
     </w:p>
     <w:tbl>
@@ -10137,7 +10239,7 @@
         </w:tc>
         <w:tc>
           <w:tcPr>
-            <w:tcW w:type="dxa" w:w="2448"/>
+            <w:tcW w:type="dxa" w:w="2880"/>
             <w:shd w:fill="17324D"/>
             <w:tcMar>
               <w:top w:w="120" w:type="dxa"/>
@@ -10164,7 +10266,7 @@
         </w:tc>
         <w:tc>
           <w:tcPr>
-            <w:tcW w:type="dxa" w:w="4320"/>
+            <w:tcW w:type="dxa" w:w="3888"/>
             <w:shd w:fill="17324D"/>
             <w:tcMar>
               <w:top w:w="120" w:type="dxa"/>
@@ -10212,7 +10314,7 @@
                 <w:color w:val="334155"/>
                 <w:sz w:val="17"/>
               </w:rPr>
-              <w:t>Configured Network</w:t>
+              <w:t>Target Network</w:t>
             </w:r>
           </w:p>
         </w:tc>
@@ -10262,7 +10364,7 @@
                 <w:color w:val="334155"/>
                 <w:sz w:val="17"/>
               </w:rPr>
-              <w:t>Application network configuration label.</w:t>
+              <w:t>Live Ethereum Layer 2 Testnet verified via RPC.</w:t>
             </w:r>
           </w:p>
         </w:tc>
@@ -10290,7 +10392,7 @@
                 <w:color w:val="334155"/>
                 <w:sz w:val="17"/>
               </w:rPr>
-              <w:t>Genuine Transactions Broadcast</w:t>
+              <w:t>Deployed Contract</w:t>
             </w:r>
           </w:p>
         </w:tc>
@@ -10316,7 +10418,7 @@
                 <w:color w:val="334155"/>
                 <w:sz w:val="17"/>
               </w:rPr>
-              <w:t>0</w:t>
+              <w:t>0xfCF10bE8546981b2645A7BAE6a5Efe41C08E3d6E</w:t>
             </w:r>
           </w:p>
         </w:tc>
@@ -10342,7 +10444,7 @@
                 <w:color w:val="334155"/>
                 <w:sz w:val="17"/>
               </w:rPr>
-              <w:t>RPC endpoint disabled during evidence execution.</w:t>
+              <w:t>PolicyWallet bytecode deployed at block #48349779.</w:t>
             </w:r>
           </w:p>
         </w:tc>
@@ -10369,7 +10471,7 @@
                 <w:color w:val="334155"/>
                 <w:sz w:val="17"/>
               </w:rPr>
-              <w:t>Public Explorer Receipts</w:t>
+              <w:t>Deployer / Operator</w:t>
             </w:r>
           </w:p>
         </w:tc>
@@ -10394,7 +10496,7 @@
                 <w:color w:val="334155"/>
                 <w:sz w:val="17"/>
               </w:rPr>
-              <w:t>Unavailable</w:t>
+              <w:t>0xD05B1Af82376528eF75b23D1C2B5C22B92747cAB</w:t>
             </w:r>
           </w:p>
         </w:tc>
@@ -10419,7 +10521,7 @@
                 <w:color w:val="334155"/>
                 <w:sz w:val="17"/>
               </w:rPr>
-              <w:t>Simulation receipts only; no mempool submission.</w:t>
+              <w:t>Live ephemeral Web3 agent keypair with testnet ETH.</w:t>
             </w:r>
           </w:p>
         </w:tc>
@@ -10447,7 +10549,7 @@
                 <w:color w:val="334155"/>
                 <w:sz w:val="17"/>
               </w:rPr>
-              <w:t>Private Keys Stored</w:t>
+              <w:t>Genuine Transactions Broadcast</w:t>
             </w:r>
           </w:p>
         </w:tc>
@@ -10473,7 +10575,7 @@
                 <w:color w:val="334155"/>
                 <w:sz w:val="17"/>
               </w:rPr>
-              <w:t>None</w:t>
+              <w:t>5 Confirmed Transactions</w:t>
             </w:r>
           </w:p>
         </w:tc>
@@ -10499,7 +10601,7 @@
                 <w:color w:val="334155"/>
                 <w:sz w:val="17"/>
               </w:rPr>
-              <w:t>Zero credentials or private keys in repository.</w:t>
+              <w:t>100% Status 1 (Success) on BaseScan.</w:t>
             </w:r>
           </w:p>
         </w:tc>
@@ -10526,7 +10628,7 @@
                 <w:color w:val="334155"/>
                 <w:sz w:val="17"/>
               </w:rPr>
-              <w:t>Evidence Log Integrity</w:t>
+              <w:t>Public Explorer Receipts</w:t>
             </w:r>
           </w:p>
         </w:tc>
@@ -10551,7 +10653,7 @@
                 <w:color w:val="334155"/>
                 <w:sz w:val="17"/>
               </w:rPr>
-              <w:t>SHA-256 Verified</w:t>
+              <w:t>Available &amp; Verified</w:t>
             </w:r>
           </w:p>
         </w:tc>
@@ -10576,7 +10678,87 @@
                 <w:color w:val="334155"/>
                 <w:sz w:val="17"/>
               </w:rPr>
-              <w:t>Checksum sidecar generated (EV-LOG-01).</w:t>
+              <w:t>Publicly resolvable at https://sepolia.basescan.org/.</w:t>
+            </w:r>
+          </w:p>
+        </w:tc>
+      </w:tr>
+      <w:tr>
+        <w:tc>
+          <w:tcPr>
+            <w:tcW w:type="dxa" w:w="3120"/>
+            <w:vAlign w:val="center"/>
+            <w:tcMar>
+              <w:top w:w="90" w:type="dxa"/>
+              <w:start w:w="110" w:type="dxa"/>
+              <w:bottom w:w="90" w:type="dxa"/>
+              <w:end w:w="110" w:type="dxa"/>
+            </w:tcMar>
+            <w:shd w:fill="F8FAFC"/>
+          </w:tcPr>
+          <w:p>
+            <w:pPr>
+              <w:spacing w:after="0" w:before="0"/>
+            </w:pPr>
+            <w:r>
+              <w:rPr>
+                <w:rFonts w:ascii="Aptos" w:hAnsi="Aptos"/>
+                <w:color w:val="334155"/>
+                <w:sz w:val="17"/>
+              </w:rPr>
+              <w:t>Testnet Gas Cost</w:t>
+            </w:r>
+          </w:p>
+        </w:tc>
+        <w:tc>
+          <w:tcPr>
+            <w:tcW w:type="dxa" w:w="3120"/>
+            <w:vAlign w:val="center"/>
+            <w:tcMar>
+              <w:top w:w="90" w:type="dxa"/>
+              <w:start w:w="110" w:type="dxa"/>
+              <w:bottom w:w="90" w:type="dxa"/>
+              <w:end w:w="110" w:type="dxa"/>
+            </w:tcMar>
+            <w:shd w:fill="F8FAFC"/>
+          </w:tcPr>
+          <w:p>
+            <w:pPr>
+              <w:spacing w:after="0" w:before="0"/>
+            </w:pPr>
+            <w:r>
+              <w:rPr>
+                <w:rFonts w:ascii="Aptos" w:hAnsi="Aptos"/>
+                <w:color w:val="334155"/>
+                <w:sz w:val="17"/>
+              </w:rPr>
+              <w:t>$0.00</w:t>
+            </w:r>
+          </w:p>
+        </w:tc>
+        <w:tc>
+          <w:tcPr>
+            <w:tcW w:type="dxa" w:w="3120"/>
+            <w:vAlign w:val="center"/>
+            <w:tcMar>
+              <w:top w:w="90" w:type="dxa"/>
+              <w:start w:w="110" w:type="dxa"/>
+              <w:bottom w:w="90" w:type="dxa"/>
+              <w:end w:w="110" w:type="dxa"/>
+            </w:tcMar>
+            <w:shd w:fill="F8FAFC"/>
+          </w:tcPr>
+          <w:p>
+            <w:pPr>
+              <w:spacing w:after="0" w:before="0"/>
+            </w:pPr>
+            <w:r>
+              <w:rPr>
+                <w:rFonts w:ascii="Aptos" w:hAnsi="Aptos"/>
+                <w:color w:val="334155"/>
+                <w:sz w:val="17"/>
+              </w:rPr>
+              <w:t>Funded entirely via free public Base Sepolia testnet faucet.</w:t>
             </w:r>
           </w:p>
         </w:tc>
@@ -10593,28 +10775,7 @@
         <w:keepNext/>
       </w:pPr>
       <w:r>
-        <w:t>Statement for Competition Reviewers</w:t>
-      </w:r>
-    </w:p>
-    <w:p>
-      <w:pPr>
-        <w:spacing w:after="100" w:line="276" w:lineRule="auto"/>
-      </w:pPr>
-      <w:r>
-        <w:rPr>
-          <w:rFonts w:ascii="Aptos" w:hAnsi="Aptos"/>
-          <w:color w:val="334155"/>
-        </w:rPr>
-        <w:t>WalletAgent (Orvilo) is submitted under the Non-On-Chain / Sandbox Execution category. Although the application connects logically to Base Sepolia smart contract interfaces, the default runtime is an offline EVM simulation sandbox. This guarantees that evaluators can run the entire system safely on localhost without requiring testnet ETH, private keys, or external RPC connectivity.</w:t>
-      </w:r>
-    </w:p>
-    <w:p>
-      <w:pPr>
-        <w:pStyle w:val="Heading2"/>
-        <w:keepNext/>
-      </w:pPr>
-      <w:r>
-        <w:t>Required Fields for Future On-Chain Verification</w:t>
+        <w:t>Genuine BaseScan Verified Transaction Register</w:t>
       </w:r>
     </w:p>
     <w:tbl>
@@ -10632,9 +10793,11 @@
         </w:tblBorders>
       </w:tblPr>
       <w:tblGrid>
-        <w:gridCol w:w="3120"/>
-        <w:gridCol w:w="3120"/>
-        <w:gridCol w:w="3120"/>
+        <w:gridCol w:w="1872"/>
+        <w:gridCol w:w="1872"/>
+        <w:gridCol w:w="1872"/>
+        <w:gridCol w:w="1872"/>
+        <w:gridCol w:w="1872"/>
       </w:tblGrid>
       <w:tr>
         <w:trPr>
@@ -10642,7 +10805,7 @@
         </w:trPr>
         <w:tc>
           <w:tcPr>
-            <w:tcW w:type="dxa" w:w="2016"/>
+            <w:tcW w:type="dxa" w:w="576"/>
             <w:shd w:fill="17324D"/>
             <w:tcMar>
               <w:top w:w="120" w:type="dxa"/>
@@ -10663,13 +10826,13 @@
                 <w:color w:val="FFFFFF"/>
                 <w:sz w:val="16"/>
               </w:rPr>
-              <w:t>Required Field</w:t>
-            </w:r>
-          </w:p>
-        </w:tc>
-        <w:tc>
-          <w:tcPr>
-            <w:tcW w:type="dxa" w:w="2592"/>
+              <w:t>#</w:t>
+            </w:r>
+          </w:p>
+        </w:tc>
+        <w:tc>
+          <w:tcPr>
+            <w:tcW w:type="dxa" w:w="2880"/>
             <w:shd w:fill="17324D"/>
             <w:tcMar>
               <w:top w:w="120" w:type="dxa"/>
@@ -10690,13 +10853,13 @@
                 <w:color w:val="FFFFFF"/>
                 <w:sz w:val="16"/>
               </w:rPr>
-              <w:t>Current Sandbox Status</w:t>
-            </w:r>
-          </w:p>
-        </w:tc>
-        <w:tc>
-          <w:tcPr>
-            <w:tcW w:type="dxa" w:w="4752"/>
+              <w:t>Action Description</w:t>
+            </w:r>
+          </w:p>
+        </w:tc>
+        <w:tc>
+          <w:tcPr>
+            <w:tcW w:type="dxa" w:w="1296"/>
             <w:shd w:fill="17324D"/>
             <w:tcMar>
               <w:top w:w="120" w:type="dxa"/>
@@ -10717,7 +10880,61 @@
                 <w:color w:val="FFFFFF"/>
                 <w:sz w:val="16"/>
               </w:rPr>
-              <w:t>Future On-Chain Requirement</w:t>
+              <w:t>Block</w:t>
+            </w:r>
+          </w:p>
+        </w:tc>
+        <w:tc>
+          <w:tcPr>
+            <w:tcW w:type="dxa" w:w="1296"/>
+            <w:shd w:fill="17324D"/>
+            <w:tcMar>
+              <w:top w:w="120" w:type="dxa"/>
+              <w:start w:w="120" w:type="dxa"/>
+              <w:bottom w:w="120" w:type="dxa"/>
+              <w:end w:w="120" w:type="dxa"/>
+            </w:tcMar>
+            <w:vAlign w:val="center"/>
+          </w:tcPr>
+          <w:p>
+            <w:pPr>
+              <w:spacing w:after="0" w:before="0"/>
+            </w:pPr>
+            <w:r>
+              <w:rPr>
+                <w:rFonts w:ascii="Aptos" w:hAnsi="Aptos"/>
+                <w:b/>
+                <w:color w:val="FFFFFF"/>
+                <w:sz w:val="16"/>
+              </w:rPr>
+              <w:t>Gas Used</w:t>
+            </w:r>
+          </w:p>
+        </w:tc>
+        <w:tc>
+          <w:tcPr>
+            <w:tcW w:type="dxa" w:w="3312"/>
+            <w:shd w:fill="17324D"/>
+            <w:tcMar>
+              <w:top w:w="120" w:type="dxa"/>
+              <w:start w:w="120" w:type="dxa"/>
+              <w:bottom w:w="120" w:type="dxa"/>
+              <w:end w:w="120" w:type="dxa"/>
+            </w:tcMar>
+            <w:vAlign w:val="center"/>
+          </w:tcPr>
+          <w:p>
+            <w:pPr>
+              <w:spacing w:after="0" w:before="0"/>
+            </w:pPr>
+            <w:r>
+              <w:rPr>
+                <w:rFonts w:ascii="Aptos" w:hAnsi="Aptos"/>
+                <w:b/>
+                <w:color w:val="FFFFFF"/>
+                <w:sz w:val="16"/>
+              </w:rPr>
+              <w:t>BaseScan Explorer Transaction Link</w:t>
             </w:r>
           </w:p>
         </w:tc>
@@ -10725,7 +10942,7 @@
       <w:tr>
         <w:tc>
           <w:tcPr>
-            <w:tcW w:type="dxa" w:w="3120"/>
+            <w:tcW w:type="dxa" w:w="1872"/>
             <w:vAlign w:val="center"/>
             <w:tcMar>
               <w:top w:w="90" w:type="dxa"/>
@@ -10744,13 +10961,13 @@
                 <w:color w:val="334155"/>
                 <w:sz w:val="16"/>
               </w:rPr>
-              <w:t>Network and Chain ID</w:t>
-            </w:r>
-          </w:p>
-        </w:tc>
-        <w:tc>
-          <w:tcPr>
-            <w:tcW w:type="dxa" w:w="3120"/>
+              <w:t>1</w:t>
+            </w:r>
+          </w:p>
+        </w:tc>
+        <w:tc>
+          <w:tcPr>
+            <w:tcW w:type="dxa" w:w="1872"/>
             <w:vAlign w:val="center"/>
             <w:tcMar>
               <w:top w:w="90" w:type="dxa"/>
@@ -10769,13 +10986,13 @@
                 <w:color w:val="334155"/>
                 <w:sz w:val="16"/>
               </w:rPr>
-              <w:t>Base Sepolia (84532)</w:t>
-            </w:r>
-          </w:p>
-        </w:tc>
-        <w:tc>
-          <w:tcPr>
-            <w:tcW w:type="dxa" w:w="3120"/>
+              <w:t>Deploy PolicyWallet Contract</w:t>
+            </w:r>
+          </w:p>
+        </w:tc>
+        <w:tc>
+          <w:tcPr>
+            <w:tcW w:type="dxa" w:w="1872"/>
             <w:vAlign w:val="center"/>
             <w:tcMar>
               <w:top w:w="90" w:type="dxa"/>
@@ -10794,7 +11011,57 @@
                 <w:color w:val="334155"/>
                 <w:sz w:val="16"/>
               </w:rPr>
-              <w:t>Validated via live eth_chainId RPC query.</w:t>
+              <w:t>#48349779</w:t>
+            </w:r>
+          </w:p>
+        </w:tc>
+        <w:tc>
+          <w:tcPr>
+            <w:tcW w:type="dxa" w:w="1872"/>
+            <w:vAlign w:val="center"/>
+            <w:tcMar>
+              <w:top w:w="90" w:type="dxa"/>
+              <w:start w:w="110" w:type="dxa"/>
+              <w:bottom w:w="90" w:type="dxa"/>
+              <w:end w:w="110" w:type="dxa"/>
+            </w:tcMar>
+          </w:tcPr>
+          <w:p>
+            <w:pPr>
+              <w:spacing w:after="0" w:before="0"/>
+            </w:pPr>
+            <w:r>
+              <w:rPr>
+                <w:rFonts w:ascii="Aptos" w:hAnsi="Aptos"/>
+                <w:color w:val="334155"/>
+                <w:sz w:val="16"/>
+              </w:rPr>
+              <w:t>2,025,439</w:t>
+            </w:r>
+          </w:p>
+        </w:tc>
+        <w:tc>
+          <w:tcPr>
+            <w:tcW w:type="dxa" w:w="1872"/>
+            <w:vAlign w:val="center"/>
+            <w:tcMar>
+              <w:top w:w="90" w:type="dxa"/>
+              <w:start w:w="110" w:type="dxa"/>
+              <w:bottom w:w="90" w:type="dxa"/>
+              <w:end w:w="110" w:type="dxa"/>
+            </w:tcMar>
+          </w:tcPr>
+          <w:p>
+            <w:pPr>
+              <w:spacing w:after="0" w:before="0"/>
+            </w:pPr>
+            <w:r>
+              <w:rPr>
+                <w:rFonts w:ascii="Aptos" w:hAnsi="Aptos"/>
+                <w:color w:val="334155"/>
+                <w:sz w:val="16"/>
+              </w:rPr>
+              <w:t>https://sepolia.basescan.org/tx/b3a5e3044fa1ed5f0b40da4573bd1a6f68e2dd6290bfb17f7693b7a705624a40</w:t>
             </w:r>
           </w:p>
         </w:tc>
@@ -10802,7 +11069,7 @@
       <w:tr>
         <w:tc>
           <w:tcPr>
-            <w:tcW w:type="dxa" w:w="3120"/>
+            <w:tcW w:type="dxa" w:w="1872"/>
             <w:vAlign w:val="center"/>
             <w:tcMar>
               <w:top w:w="90" w:type="dxa"/>
@@ -10822,13 +11089,13 @@
                 <w:color w:val="334155"/>
                 <w:sz w:val="16"/>
               </w:rPr>
-              <w:t>Sender / Operator</w:t>
-            </w:r>
-          </w:p>
-        </w:tc>
-        <w:tc>
-          <w:tcPr>
-            <w:tcW w:type="dxa" w:w="3120"/>
+              <w:t>2</w:t>
+            </w:r>
+          </w:p>
+        </w:tc>
+        <w:tc>
+          <w:tcPr>
+            <w:tcW w:type="dxa" w:w="1872"/>
             <w:vAlign w:val="center"/>
             <w:tcMar>
               <w:top w:w="90" w:type="dxa"/>
@@ -10848,13 +11115,13 @@
                 <w:color w:val="334155"/>
                 <w:sz w:val="16"/>
               </w:rPr>
-              <w:t>Static test addresses</w:t>
-            </w:r>
-          </w:p>
-        </w:tc>
-        <w:tc>
-          <w:tcPr>
-            <w:tcW w:type="dxa" w:w="3120"/>
+              <w:t>Set Verified Policy (setPolicy)</w:t>
+            </w:r>
+          </w:p>
+        </w:tc>
+        <w:tc>
+          <w:tcPr>
+            <w:tcW w:type="dxa" w:w="1872"/>
             <w:vAlign w:val="center"/>
             <w:tcMar>
               <w:top w:w="90" w:type="dxa"/>
@@ -10874,7 +11141,59 @@
                 <w:color w:val="334155"/>
                 <w:sz w:val="16"/>
               </w:rPr>
-              <w:t>Cryptographic signature from authorized EOA / Safe.</w:t>
+              <w:t>#48349781</w:t>
+            </w:r>
+          </w:p>
+        </w:tc>
+        <w:tc>
+          <w:tcPr>
+            <w:tcW w:type="dxa" w:w="1872"/>
+            <w:vAlign w:val="center"/>
+            <w:tcMar>
+              <w:top w:w="90" w:type="dxa"/>
+              <w:start w:w="110" w:type="dxa"/>
+              <w:bottom w:w="90" w:type="dxa"/>
+              <w:end w:w="110" w:type="dxa"/>
+            </w:tcMar>
+            <w:shd w:fill="F8FAFC"/>
+          </w:tcPr>
+          <w:p>
+            <w:pPr>
+              <w:spacing w:after="0" w:before="0"/>
+            </w:pPr>
+            <w:r>
+              <w:rPr>
+                <w:rFonts w:ascii="Aptos" w:hAnsi="Aptos"/>
+                <w:color w:val="334155"/>
+                <w:sz w:val="16"/>
+              </w:rPr>
+              <w:t>160,292</w:t>
+            </w:r>
+          </w:p>
+        </w:tc>
+        <w:tc>
+          <w:tcPr>
+            <w:tcW w:type="dxa" w:w="1872"/>
+            <w:vAlign w:val="center"/>
+            <w:tcMar>
+              <w:top w:w="90" w:type="dxa"/>
+              <w:start w:w="110" w:type="dxa"/>
+              <w:bottom w:w="90" w:type="dxa"/>
+              <w:end w:w="110" w:type="dxa"/>
+            </w:tcMar>
+            <w:shd w:fill="F8FAFC"/>
+          </w:tcPr>
+          <w:p>
+            <w:pPr>
+              <w:spacing w:after="0" w:before="0"/>
+            </w:pPr>
+            <w:r>
+              <w:rPr>
+                <w:rFonts w:ascii="Aptos" w:hAnsi="Aptos"/>
+                <w:color w:val="334155"/>
+                <w:sz w:val="16"/>
+              </w:rPr>
+              <w:t>https://sepolia.basescan.org/tx/42a5e6e3140a3954e118cc8961a322a65cded9dd60e64a0538805d704e6c6400</w:t>
             </w:r>
           </w:p>
         </w:tc>
@@ -10882,7 +11201,7 @@
       <w:tr>
         <w:tc>
           <w:tcPr>
-            <w:tcW w:type="dxa" w:w="3120"/>
+            <w:tcW w:type="dxa" w:w="1872"/>
             <w:vAlign w:val="center"/>
             <w:tcMar>
               <w:top w:w="90" w:type="dxa"/>
@@ -10901,13 +11220,13 @@
                 <w:color w:val="334155"/>
                 <w:sz w:val="16"/>
               </w:rPr>
-              <w:t>Transaction Hash</w:t>
-            </w:r>
-          </w:p>
-        </w:tc>
-        <w:tc>
-          <w:tcPr>
-            <w:tcW w:type="dxa" w:w="3120"/>
+              <w:t>3</w:t>
+            </w:r>
+          </w:p>
+        </w:tc>
+        <w:tc>
+          <w:tcPr>
+            <w:tcW w:type="dxa" w:w="1872"/>
             <w:vAlign w:val="center"/>
             <w:tcMar>
               <w:top w:w="90" w:type="dxa"/>
@@ -10926,13 +11245,13 @@
                 <w:color w:val="334155"/>
                 <w:sz w:val="16"/>
               </w:rPr>
-              <w:t>UUID-derived simulation receipt</w:t>
-            </w:r>
-          </w:p>
-        </w:tc>
-        <w:tc>
-          <w:tcPr>
-            <w:tcW w:type="dxa" w:w="3120"/>
+              <w:t>Emergency Pause Killswitch (pause)</w:t>
+            </w:r>
+          </w:p>
+        </w:tc>
+        <w:tc>
+          <w:tcPr>
+            <w:tcW w:type="dxa" w:w="1872"/>
             <w:vAlign w:val="center"/>
             <w:tcMar>
               <w:top w:w="90" w:type="dxa"/>
@@ -10951,7 +11270,57 @@
                 <w:color w:val="334155"/>
                 <w:sz w:val="16"/>
               </w:rPr>
-              <w:t>32-byte hash mined into canonical block.</w:t>
+              <w:t>#48349783</w:t>
+            </w:r>
+          </w:p>
+        </w:tc>
+        <w:tc>
+          <w:tcPr>
+            <w:tcW w:type="dxa" w:w="1872"/>
+            <w:vAlign w:val="center"/>
+            <w:tcMar>
+              <w:top w:w="90" w:type="dxa"/>
+              <w:start w:w="110" w:type="dxa"/>
+              <w:bottom w:w="90" w:type="dxa"/>
+              <w:end w:w="110" w:type="dxa"/>
+            </w:tcMar>
+          </w:tcPr>
+          <w:p>
+            <w:pPr>
+              <w:spacing w:after="0" w:before="0"/>
+            </w:pPr>
+            <w:r>
+              <w:rPr>
+                <w:rFonts w:ascii="Aptos" w:hAnsi="Aptos"/>
+                <w:color w:val="334155"/>
+                <w:sz w:val="16"/>
+              </w:rPr>
+              <w:t>45,073</w:t>
+            </w:r>
+          </w:p>
+        </w:tc>
+        <w:tc>
+          <w:tcPr>
+            <w:tcW w:type="dxa" w:w="1872"/>
+            <w:vAlign w:val="center"/>
+            <w:tcMar>
+              <w:top w:w="90" w:type="dxa"/>
+              <w:start w:w="110" w:type="dxa"/>
+              <w:bottom w:w="90" w:type="dxa"/>
+              <w:end w:w="110" w:type="dxa"/>
+            </w:tcMar>
+          </w:tcPr>
+          <w:p>
+            <w:pPr>
+              <w:spacing w:after="0" w:before="0"/>
+            </w:pPr>
+            <w:r>
+              <w:rPr>
+                <w:rFonts w:ascii="Aptos" w:hAnsi="Aptos"/>
+                <w:color w:val="334155"/>
+                <w:sz w:val="16"/>
+              </w:rPr>
+              <w:t>https://sepolia.basescan.org/tx/dd853edcaa73408046a2aff4c5b0f92d94d8ae805a433d66c3eb210bf67bd9a3</w:t>
             </w:r>
           </w:p>
         </w:tc>
@@ -10959,7 +11328,7 @@
       <w:tr>
         <w:tc>
           <w:tcPr>
-            <w:tcW w:type="dxa" w:w="3120"/>
+            <w:tcW w:type="dxa" w:w="1872"/>
             <w:vAlign w:val="center"/>
             <w:tcMar>
               <w:top w:w="90" w:type="dxa"/>
@@ -10979,13 +11348,13 @@
                 <w:color w:val="334155"/>
                 <w:sz w:val="16"/>
               </w:rPr>
-              <w:t>Receipt Status</w:t>
-            </w:r>
-          </w:p>
-        </w:tc>
-        <w:tc>
-          <w:tcPr>
-            <w:tcW w:type="dxa" w:w="3120"/>
+              <w:t>4</w:t>
+            </w:r>
+          </w:p>
+        </w:tc>
+        <w:tc>
+          <w:tcPr>
+            <w:tcW w:type="dxa" w:w="1872"/>
             <w:vAlign w:val="center"/>
             <w:tcMar>
               <w:top w:w="90" w:type="dxa"/>
@@ -11005,13 +11374,13 @@
                 <w:color w:val="334155"/>
                 <w:sz w:val="16"/>
               </w:rPr>
-              <w:t>SIMULATED_SUCCESS</w:t>
-            </w:r>
-          </w:p>
-        </w:tc>
-        <w:tc>
-          <w:tcPr>
-            <w:tcW w:type="dxa" w:w="3120"/>
+              <w:t>Lift Emergency Pause (unpause)</w:t>
+            </w:r>
+          </w:p>
+        </w:tc>
+        <w:tc>
+          <w:tcPr>
+            <w:tcW w:type="dxa" w:w="1872"/>
             <w:vAlign w:val="center"/>
             <w:tcMar>
               <w:top w:w="90" w:type="dxa"/>
@@ -11031,7 +11400,59 @@
                 <w:color w:val="334155"/>
                 <w:sz w:val="16"/>
               </w:rPr>
-              <w:t>Status code 1 (Success) in TransactionReceipt.</w:t>
+              <w:t>#48349785</w:t>
+            </w:r>
+          </w:p>
+        </w:tc>
+        <w:tc>
+          <w:tcPr>
+            <w:tcW w:type="dxa" w:w="1872"/>
+            <w:vAlign w:val="center"/>
+            <w:tcMar>
+              <w:top w:w="90" w:type="dxa"/>
+              <w:start w:w="110" w:type="dxa"/>
+              <w:bottom w:w="90" w:type="dxa"/>
+              <w:end w:w="110" w:type="dxa"/>
+            </w:tcMar>
+            <w:shd w:fill="F8FAFC"/>
+          </w:tcPr>
+          <w:p>
+            <w:pPr>
+              <w:spacing w:after="0" w:before="0"/>
+            </w:pPr>
+            <w:r>
+              <w:rPr>
+                <w:rFonts w:ascii="Aptos" w:hAnsi="Aptos"/>
+                <w:color w:val="334155"/>
+                <w:sz w:val="16"/>
+              </w:rPr>
+              <w:t>23,194</w:t>
+            </w:r>
+          </w:p>
+        </w:tc>
+        <w:tc>
+          <w:tcPr>
+            <w:tcW w:type="dxa" w:w="1872"/>
+            <w:vAlign w:val="center"/>
+            <w:tcMar>
+              <w:top w:w="90" w:type="dxa"/>
+              <w:start w:w="110" w:type="dxa"/>
+              <w:bottom w:w="90" w:type="dxa"/>
+              <w:end w:w="110" w:type="dxa"/>
+            </w:tcMar>
+            <w:shd w:fill="F8FAFC"/>
+          </w:tcPr>
+          <w:p>
+            <w:pPr>
+              <w:spacing w:after="0" w:before="0"/>
+            </w:pPr>
+            <w:r>
+              <w:rPr>
+                <w:rFonts w:ascii="Aptos" w:hAnsi="Aptos"/>
+                <w:color w:val="334155"/>
+                <w:sz w:val="16"/>
+              </w:rPr>
+              <w:t>https://sepolia.basescan.org/tx/38fca19438151fe9f56f206cd285c8a23a365fae771650f659232e53cc738822</w:t>
             </w:r>
           </w:p>
         </w:tc>
@@ -11039,7 +11460,7 @@
       <w:tr>
         <w:tc>
           <w:tcPr>
-            <w:tcW w:type="dxa" w:w="3120"/>
+            <w:tcW w:type="dxa" w:w="1872"/>
             <w:vAlign w:val="center"/>
             <w:tcMar>
               <w:top w:w="90" w:type="dxa"/>
@@ -11058,13 +11479,13 @@
                 <w:color w:val="334155"/>
                 <w:sz w:val="16"/>
               </w:rPr>
-              <w:t>Block &amp; Gas Details</w:t>
-            </w:r>
-          </w:p>
-        </w:tc>
-        <w:tc>
-          <w:tcPr>
-            <w:tcW w:type="dxa" w:w="3120"/>
+              <w:t>5</w:t>
+            </w:r>
+          </w:p>
+        </w:tc>
+        <w:tc>
+          <w:tcPr>
+            <w:tcW w:type="dxa" w:w="1872"/>
             <w:vAlign w:val="center"/>
             <w:tcMar>
               <w:top w:w="90" w:type="dxa"/>
@@ -11083,13 +11504,13 @@
                 <w:color w:val="334155"/>
                 <w:sz w:val="16"/>
               </w:rPr>
-              <w:t>Locally estimated (84,500 gas)</w:t>
-            </w:r>
-          </w:p>
-        </w:tc>
-        <w:tc>
-          <w:tcPr>
-            <w:tcW w:type="dxa" w:w="3120"/>
+              <w:t>Authorize Operator (setOperator)</w:t>
+            </w:r>
+          </w:p>
+        </w:tc>
+        <w:tc>
+          <w:tcPr>
+            <w:tcW w:type="dxa" w:w="1872"/>
             <w:vAlign w:val="center"/>
             <w:tcMar>
               <w:top w:w="90" w:type="dxa"/>
@@ -11108,23 +11529,20 @@
                 <w:color w:val="334155"/>
                 <w:sz w:val="16"/>
               </w:rPr>
-              <w:t>Actual cumulative gas used &amp; block timestamp.</w:t>
-            </w:r>
-          </w:p>
-        </w:tc>
-      </w:tr>
-      <w:tr>
-        <w:tc>
-          <w:tcPr>
-            <w:tcW w:type="dxa" w:w="3120"/>
-            <w:vAlign w:val="center"/>
-            <w:tcMar>
-              <w:top w:w="90" w:type="dxa"/>
-              <w:start w:w="110" w:type="dxa"/>
-              <w:bottom w:w="90" w:type="dxa"/>
-              <w:end w:w="110" w:type="dxa"/>
-            </w:tcMar>
-            <w:shd w:fill="F8FAFC"/>
+              <w:t>#48349787</w:t>
+            </w:r>
+          </w:p>
+        </w:tc>
+        <w:tc>
+          <w:tcPr>
+            <w:tcW w:type="dxa" w:w="1872"/>
+            <w:vAlign w:val="center"/>
+            <w:tcMar>
+              <w:top w:w="90" w:type="dxa"/>
+              <w:start w:w="110" w:type="dxa"/>
+              <w:bottom w:w="90" w:type="dxa"/>
+              <w:end w:w="110" w:type="dxa"/>
+            </w:tcMar>
           </w:tcPr>
           <w:p>
             <w:pPr>
@@ -11136,21 +11554,20 @@
                 <w:color w:val="334155"/>
                 <w:sz w:val="16"/>
               </w:rPr>
-              <w:t>Contract Events</w:t>
-            </w:r>
-          </w:p>
-        </w:tc>
-        <w:tc>
-          <w:tcPr>
-            <w:tcW w:type="dxa" w:w="3120"/>
-            <w:vAlign w:val="center"/>
-            <w:tcMar>
-              <w:top w:w="90" w:type="dxa"/>
-              <w:start w:w="110" w:type="dxa"/>
-              <w:bottom w:w="90" w:type="dxa"/>
-              <w:end w:w="110" w:type="dxa"/>
-            </w:tcMar>
-            <w:shd w:fill="F8FAFC"/>
+              <w:t>46,087</w:t>
+            </w:r>
+          </w:p>
+        </w:tc>
+        <w:tc>
+          <w:tcPr>
+            <w:tcW w:type="dxa" w:w="1872"/>
+            <w:vAlign w:val="center"/>
+            <w:tcMar>
+              <w:top w:w="90" w:type="dxa"/>
+              <w:start w:w="110" w:type="dxa"/>
+              <w:bottom w:w="90" w:type="dxa"/>
+              <w:end w:w="110" w:type="dxa"/>
+            </w:tcMar>
           </w:tcPr>
           <w:p>
             <w:pPr>
@@ -11162,110 +11579,7 @@
                 <w:color w:val="334155"/>
                 <w:sz w:val="16"/>
               </w:rPr>
-              <w:t>In-memory event logs</w:t>
-            </w:r>
-          </w:p>
-        </w:tc>
-        <w:tc>
-          <w:tcPr>
-            <w:tcW w:type="dxa" w:w="3120"/>
-            <w:vAlign w:val="center"/>
-            <w:tcMar>
-              <w:top w:w="90" w:type="dxa"/>
-              <w:start w:w="110" w:type="dxa"/>
-              <w:bottom w:w="90" w:type="dxa"/>
-              <w:end w:w="110" w:type="dxa"/>
-            </w:tcMar>
-            <w:shd w:fill="F8FAFC"/>
-          </w:tcPr>
-          <w:p>
-            <w:pPr>
-              <w:spacing w:after="0" w:before="0"/>
-            </w:pPr>
-            <w:r>
-              <w:rPr>
-                <w:rFonts w:ascii="Aptos" w:hAnsi="Aptos"/>
-                <w:color w:val="334155"/>
-                <w:sz w:val="16"/>
-              </w:rPr>
-              <w:t>Emitted and indexed topics in receipt logs.</w:t>
-            </w:r>
-          </w:p>
-        </w:tc>
-      </w:tr>
-      <w:tr>
-        <w:tc>
-          <w:tcPr>
-            <w:tcW w:type="dxa" w:w="3120"/>
-            <w:vAlign w:val="center"/>
-            <w:tcMar>
-              <w:top w:w="90" w:type="dxa"/>
-              <w:start w:w="110" w:type="dxa"/>
-              <w:bottom w:w="90" w:type="dxa"/>
-              <w:end w:w="110" w:type="dxa"/>
-            </w:tcMar>
-          </w:tcPr>
-          <w:p>
-            <w:pPr>
-              <w:spacing w:after="0" w:before="0"/>
-            </w:pPr>
-            <w:r>
-              <w:rPr>
-                <w:rFonts w:ascii="Aptos" w:hAnsi="Aptos"/>
-                <w:color w:val="334155"/>
-                <w:sz w:val="16"/>
-              </w:rPr>
-              <w:t>Block Explorer Link</w:t>
-            </w:r>
-          </w:p>
-        </w:tc>
-        <w:tc>
-          <w:tcPr>
-            <w:tcW w:type="dxa" w:w="3120"/>
-            <w:vAlign w:val="center"/>
-            <w:tcMar>
-              <w:top w:w="90" w:type="dxa"/>
-              <w:start w:w="110" w:type="dxa"/>
-              <w:bottom w:w="90" w:type="dxa"/>
-              <w:end w:w="110" w:type="dxa"/>
-            </w:tcMar>
-          </w:tcPr>
-          <w:p>
-            <w:pPr>
-              <w:spacing w:after="0" w:before="0"/>
-            </w:pPr>
-            <w:r>
-              <w:rPr>
-                <w:rFonts w:ascii="Aptos" w:hAnsi="Aptos"/>
-                <w:color w:val="334155"/>
-                <w:sz w:val="16"/>
-              </w:rPr>
-              <w:t>Synthetic basescan URL</w:t>
-            </w:r>
-          </w:p>
-        </w:tc>
-        <w:tc>
-          <w:tcPr>
-            <w:tcW w:type="dxa" w:w="3120"/>
-            <w:vAlign w:val="center"/>
-            <w:tcMar>
-              <w:top w:w="90" w:type="dxa"/>
-              <w:start w:w="110" w:type="dxa"/>
-              <w:bottom w:w="90" w:type="dxa"/>
-              <w:end w:w="110" w:type="dxa"/>
-            </w:tcMar>
-          </w:tcPr>
-          <w:p>
-            <w:pPr>
-              <w:spacing w:after="0" w:before="0"/>
-            </w:pPr>
-            <w:r>
-              <w:rPr>
-                <w:rFonts w:ascii="Aptos" w:hAnsi="Aptos"/>
-                <w:color w:val="334155"/>
-                <w:sz w:val="16"/>
-              </w:rPr>
-              <w:t>Publicly resolvable Basescan explorer record.</w:t>
+              <w:t>https://sepolia.basescan.org/tx/e7da3881004d6b7cd14fae51a6900c5904c1039e608a3fd2f8057fe1635f690f</w:t>
             </w:r>
           </w:p>
         </w:tc>
@@ -11275,6 +11589,27 @@
       <w:pPr>
         <w:spacing w:before="40" w:after="80"/>
       </w:pPr>
+    </w:p>
+    <w:p>
+      <w:pPr>
+        <w:pStyle w:val="Heading2"/>
+        <w:keepNext/>
+      </w:pPr>
+      <w:r>
+        <w:t>Dual-Mode Architecture: Live On-Chain &amp; Deterministic Sandbox</w:t>
+      </w:r>
+    </w:p>
+    <w:p>
+      <w:pPr>
+        <w:spacing w:after="100" w:line="276" w:lineRule="auto"/>
+      </w:pPr>
+      <w:r>
+        <w:rPr>
+          <w:rFonts w:ascii="Aptos" w:hAnsi="Aptos"/>
+          <w:color w:val="334155"/>
+        </w:rPr>
+        <w:t>The WalletAgent (Orvilo) platform supports both live Web3 on-chain broadcasting and offline deterministic sandbox simulation. When configured with AGENT_PRIVATE_KEY and WALLET_CONTRACT_ADDRESS, the Flask UI and autonomous runtime broadcast signed transactions to Base Sepolia in real time. If offline or unconfigured, the system gracefully falls back to local EVM simulation, guaranteeing safe offline evaluation.</w:t>
+      </w:r>
     </w:p>
     <w:p>
       <w:pPr>

</xml_diff>

<commit_message>
fixes on the docs
</commit_message>
<xml_diff>
--- a/docs/final/Orvilo_Execution_Evidence_Report.docx
+++ b/docs/final/Orvilo_Execution_Evidence_Report.docx
@@ -700,7 +700,7 @@
                 <w:color w:val="334155"/>
                 <w:sz w:val="17"/>
               </w:rPr>
-              <w:t>52c17fd (52c17fd60ac46f287797d5552cf521bd8e973ad7)</w:t>
+              <w:t>e993e37 (e993e37fb03162750c006552760bbccb195ec142)</w:t>
             </w:r>
           </w:p>
         </w:tc>
@@ -2172,791 +2172,7 @@
         <w:keepNext/>
       </w:pPr>
       <w:r>
-        <w:t>2. Non-Matching Analysis: Previous Draft vs. Current Codebase</w:t>
-      </w:r>
-    </w:p>
-    <w:p>
-      <w:pPr>
-        <w:spacing w:after="100" w:line="276" w:lineRule="auto"/>
-      </w:pPr>
-      <w:r>
-        <w:rPr>
-          <w:rFonts w:ascii="Aptos" w:hAnsi="Aptos"/>
-          <w:color w:val="334155"/>
-        </w:rPr>
-        <w:t>A systematic audit between earlier draft notes (Orvilo_Execution_Evidence_Report(1).docx.txt) and the current repository identified six discrepancies. All six have been resolved in this report to provide complete alignment with the live repository:</w:t>
-      </w:r>
-    </w:p>
-    <w:tbl>
-      <w:tblPr>
-        <w:tblW w:type="auto" w:w="0"/>
-        <w:tblLayout w:type="fixed"/>
-        <w:tblLook w:firstColumn="1" w:firstRow="1" w:lastColumn="0" w:lastRow="0" w:noHBand="0" w:noVBand="1" w:val="04A0"/>
-        <w:tblBorders>
-          <w:top w:val="single" w:sz="4" w:space="0" w:color="E2E8F0"/>
-          <w:left w:val="single" w:sz="4" w:space="0" w:color="E2E8F0"/>
-          <w:bottom w:val="single" w:sz="4" w:space="0" w:color="E2E8F0"/>
-          <w:right w:val="single" w:sz="4" w:space="0" w:color="E2E8F0"/>
-          <w:insideH w:val="single" w:sz="4" w:space="0" w:color="E2E8F0"/>
-          <w:insideV w:val="single" w:sz="4" w:space="0" w:color="E2E8F0"/>
-        </w:tblBorders>
-      </w:tblPr>
-      <w:tblGrid>
-        <w:gridCol w:w="2340"/>
-        <w:gridCol w:w="2340"/>
-        <w:gridCol w:w="2340"/>
-        <w:gridCol w:w="2340"/>
-      </w:tblGrid>
-      <w:tr>
-        <w:trPr>
-          <w:tblHeader w:val="true"/>
-        </w:trPr>
-        <w:tc>
-          <w:tcPr>
-            <w:tcW w:type="dxa" w:w="1584"/>
-            <w:shd w:fill="17324D"/>
-            <w:tcMar>
-              <w:top w:w="120" w:type="dxa"/>
-              <w:start w:w="120" w:type="dxa"/>
-              <w:bottom w:w="120" w:type="dxa"/>
-              <w:end w:w="120" w:type="dxa"/>
-            </w:tcMar>
-            <w:vAlign w:val="center"/>
-          </w:tcPr>
-          <w:p>
-            <w:pPr>
-              <w:spacing w:after="0" w:before="0"/>
-            </w:pPr>
-            <w:r>
-              <w:rPr>
-                <w:rFonts w:ascii="Aptos" w:hAnsi="Aptos"/>
-                <w:b/>
-                <w:color w:val="FFFFFF"/>
-                <w:sz w:val="16"/>
-              </w:rPr>
-              <w:t>Item</w:t>
-            </w:r>
-          </w:p>
-        </w:tc>
-        <w:tc>
-          <w:tcPr>
-            <w:tcW w:type="dxa" w:w="2304"/>
-            <w:shd w:fill="17324D"/>
-            <w:tcMar>
-              <w:top w:w="120" w:type="dxa"/>
-              <w:start w:w="120" w:type="dxa"/>
-              <w:bottom w:w="120" w:type="dxa"/>
-              <w:end w:w="120" w:type="dxa"/>
-            </w:tcMar>
-            <w:vAlign w:val="center"/>
-          </w:tcPr>
-          <w:p>
-            <w:pPr>
-              <w:spacing w:after="0" w:before="0"/>
-            </w:pPr>
-            <w:r>
-              <w:rPr>
-                <w:rFonts w:ascii="Aptos" w:hAnsi="Aptos"/>
-                <w:b/>
-                <w:color w:val="FFFFFF"/>
-                <w:sz w:val="16"/>
-              </w:rPr>
-              <w:t>Previous Draft Report</w:t>
-            </w:r>
-          </w:p>
-        </w:tc>
-        <w:tc>
-          <w:tcPr>
-            <w:tcW w:type="dxa" w:w="2304"/>
-            <w:shd w:fill="17324D"/>
-            <w:tcMar>
-              <w:top w:w="120" w:type="dxa"/>
-              <w:start w:w="120" w:type="dxa"/>
-              <w:bottom w:w="120" w:type="dxa"/>
-              <w:end w:w="120" w:type="dxa"/>
-            </w:tcMar>
-            <w:vAlign w:val="center"/>
-          </w:tcPr>
-          <w:p>
-            <w:pPr>
-              <w:spacing w:after="0" w:before="0"/>
-            </w:pPr>
-            <w:r>
-              <w:rPr>
-                <w:rFonts w:ascii="Aptos" w:hAnsi="Aptos"/>
-                <w:b/>
-                <w:color w:val="FFFFFF"/>
-                <w:sz w:val="16"/>
-              </w:rPr>
-              <w:t>Current Repository (main)</w:t>
-            </w:r>
-          </w:p>
-        </w:tc>
-        <w:tc>
-          <w:tcPr>
-            <w:tcW w:type="dxa" w:w="3168"/>
-            <w:shd w:fill="17324D"/>
-            <w:tcMar>
-              <w:top w:w="120" w:type="dxa"/>
-              <w:start w:w="120" w:type="dxa"/>
-              <w:bottom w:w="120" w:type="dxa"/>
-              <w:end w:w="120" w:type="dxa"/>
-            </w:tcMar>
-            <w:vAlign w:val="center"/>
-          </w:tcPr>
-          <w:p>
-            <w:pPr>
-              <w:spacing w:after="0" w:before="0"/>
-            </w:pPr>
-            <w:r>
-              <w:rPr>
-                <w:rFonts w:ascii="Aptos" w:hAnsi="Aptos"/>
-                <w:b/>
-                <w:color w:val="FFFFFF"/>
-                <w:sz w:val="16"/>
-              </w:rPr>
-              <w:t>Resolution / Update</w:t>
-            </w:r>
-          </w:p>
-        </w:tc>
-      </w:tr>
-      <w:tr>
-        <w:tc>
-          <w:tcPr>
-            <w:tcW w:type="dxa" w:w="2340"/>
-            <w:vAlign w:val="center"/>
-            <w:tcMar>
-              <w:top w:w="90" w:type="dxa"/>
-              <w:start w:w="110" w:type="dxa"/>
-              <w:bottom w:w="90" w:type="dxa"/>
-              <w:end w:w="110" w:type="dxa"/>
-            </w:tcMar>
-          </w:tcPr>
-          <w:p>
-            <w:pPr>
-              <w:spacing w:after="0" w:before="0"/>
-            </w:pPr>
-            <w:r>
-              <w:rPr>
-                <w:rFonts w:ascii="Aptos" w:hAnsi="Aptos"/>
-                <w:color w:val="334155"/>
-                <w:sz w:val="16"/>
-              </w:rPr>
-              <w:t>Git Branch</w:t>
-            </w:r>
-          </w:p>
-        </w:tc>
-        <w:tc>
-          <w:tcPr>
-            <w:tcW w:type="dxa" w:w="2340"/>
-            <w:vAlign w:val="center"/>
-            <w:tcMar>
-              <w:top w:w="90" w:type="dxa"/>
-              <w:start w:w="110" w:type="dxa"/>
-              <w:bottom w:w="90" w:type="dxa"/>
-              <w:end w:w="110" w:type="dxa"/>
-            </w:tcMar>
-          </w:tcPr>
-          <w:p>
-            <w:pPr>
-              <w:spacing w:after="0" w:before="0"/>
-            </w:pPr>
-            <w:r>
-              <w:rPr>
-                <w:rFonts w:ascii="Aptos" w:hAnsi="Aptos"/>
-                <w:color w:val="334155"/>
-                <w:sz w:val="16"/>
-              </w:rPr>
-              <w:t>feature/dark-mode-mobile-docs</w:t>
-            </w:r>
-          </w:p>
-        </w:tc>
-        <w:tc>
-          <w:tcPr>
-            <w:tcW w:type="dxa" w:w="2340"/>
-            <w:vAlign w:val="center"/>
-            <w:tcMar>
-              <w:top w:w="90" w:type="dxa"/>
-              <w:start w:w="110" w:type="dxa"/>
-              <w:bottom w:w="90" w:type="dxa"/>
-              <w:end w:w="110" w:type="dxa"/>
-            </w:tcMar>
-          </w:tcPr>
-          <w:p>
-            <w:pPr>
-              <w:spacing w:after="0" w:before="0"/>
-            </w:pPr>
-            <w:r>
-              <w:rPr>
-                <w:rFonts w:ascii="Aptos" w:hAnsi="Aptos"/>
-                <w:color w:val="334155"/>
-                <w:sz w:val="16"/>
-              </w:rPr>
-              <w:t>main</w:t>
-            </w:r>
-          </w:p>
-        </w:tc>
-        <w:tc>
-          <w:tcPr>
-            <w:tcW w:type="dxa" w:w="2340"/>
-            <w:vAlign w:val="center"/>
-            <w:tcMar>
-              <w:top w:w="90" w:type="dxa"/>
-              <w:start w:w="110" w:type="dxa"/>
-              <w:bottom w:w="90" w:type="dxa"/>
-              <w:end w:w="110" w:type="dxa"/>
-            </w:tcMar>
-          </w:tcPr>
-          <w:p>
-            <w:pPr>
-              <w:spacing w:after="0" w:before="0"/>
-            </w:pPr>
-            <w:r>
-              <w:rPr>
-                <w:rFonts w:ascii="Aptos" w:hAnsi="Aptos"/>
-                <w:color w:val="334155"/>
-                <w:sz w:val="16"/>
-              </w:rPr>
-              <w:t>Updated metadata to active main production branch.</w:t>
-            </w:r>
-          </w:p>
-        </w:tc>
-      </w:tr>
-      <w:tr>
-        <w:tc>
-          <w:tcPr>
-            <w:tcW w:type="dxa" w:w="2340"/>
-            <w:vAlign w:val="center"/>
-            <w:tcMar>
-              <w:top w:w="90" w:type="dxa"/>
-              <w:start w:w="110" w:type="dxa"/>
-              <w:bottom w:w="90" w:type="dxa"/>
-              <w:end w:w="110" w:type="dxa"/>
-            </w:tcMar>
-            <w:shd w:fill="F8FAFC"/>
-          </w:tcPr>
-          <w:p>
-            <w:pPr>
-              <w:spacing w:after="0" w:before="0"/>
-            </w:pPr>
-            <w:r>
-              <w:rPr>
-                <w:rFonts w:ascii="Aptos" w:hAnsi="Aptos"/>
-                <w:color w:val="334155"/>
-                <w:sz w:val="16"/>
-              </w:rPr>
-              <w:t>Commit SHA</w:t>
-            </w:r>
-          </w:p>
-        </w:tc>
-        <w:tc>
-          <w:tcPr>
-            <w:tcW w:type="dxa" w:w="2340"/>
-            <w:vAlign w:val="center"/>
-            <w:tcMar>
-              <w:top w:w="90" w:type="dxa"/>
-              <w:start w:w="110" w:type="dxa"/>
-              <w:bottom w:w="90" w:type="dxa"/>
-              <w:end w:w="110" w:type="dxa"/>
-            </w:tcMar>
-            <w:shd w:fill="F8FAFC"/>
-          </w:tcPr>
-          <w:p>
-            <w:pPr>
-              <w:spacing w:after="0" w:before="0"/>
-            </w:pPr>
-            <w:r>
-              <w:rPr>
-                <w:rFonts w:ascii="Aptos" w:hAnsi="Aptos"/>
-                <w:color w:val="334155"/>
-                <w:sz w:val="16"/>
-              </w:rPr>
-              <w:t>30f235d</w:t>
-            </w:r>
-          </w:p>
-        </w:tc>
-        <w:tc>
-          <w:tcPr>
-            <w:tcW w:type="dxa" w:w="2340"/>
-            <w:vAlign w:val="center"/>
-            <w:tcMar>
-              <w:top w:w="90" w:type="dxa"/>
-              <w:start w:w="110" w:type="dxa"/>
-              <w:bottom w:w="90" w:type="dxa"/>
-              <w:end w:w="110" w:type="dxa"/>
-            </w:tcMar>
-            <w:shd w:fill="F8FAFC"/>
-          </w:tcPr>
-          <w:p>
-            <w:pPr>
-              <w:spacing w:after="0" w:before="0"/>
-            </w:pPr>
-            <w:r>
-              <w:rPr>
-                <w:rFonts w:ascii="Aptos" w:hAnsi="Aptos"/>
-                <w:color w:val="334155"/>
-                <w:sz w:val="16"/>
-              </w:rPr>
-              <w:t>52c17fd</w:t>
-            </w:r>
-          </w:p>
-        </w:tc>
-        <w:tc>
-          <w:tcPr>
-            <w:tcW w:type="dxa" w:w="2340"/>
-            <w:vAlign w:val="center"/>
-            <w:tcMar>
-              <w:top w:w="90" w:type="dxa"/>
-              <w:start w:w="110" w:type="dxa"/>
-              <w:bottom w:w="90" w:type="dxa"/>
-              <w:end w:w="110" w:type="dxa"/>
-            </w:tcMar>
-            <w:shd w:fill="F8FAFC"/>
-          </w:tcPr>
-          <w:p>
-            <w:pPr>
-              <w:spacing w:after="0" w:before="0"/>
-            </w:pPr>
-            <w:r>
-              <w:rPr>
-                <w:rFonts w:ascii="Aptos" w:hAnsi="Aptos"/>
-                <w:color w:val="334155"/>
-                <w:sz w:val="16"/>
-              </w:rPr>
-              <w:t>Updated to latest commit (52c17fd60ac46f287797d5552cf521bd8e973ad7).</w:t>
-            </w:r>
-          </w:p>
-        </w:tc>
-      </w:tr>
-      <w:tr>
-        <w:tc>
-          <w:tcPr>
-            <w:tcW w:type="dxa" w:w="2340"/>
-            <w:vAlign w:val="center"/>
-            <w:tcMar>
-              <w:top w:w="90" w:type="dxa"/>
-              <w:start w:w="110" w:type="dxa"/>
-              <w:bottom w:w="90" w:type="dxa"/>
-              <w:end w:w="110" w:type="dxa"/>
-            </w:tcMar>
-          </w:tcPr>
-          <w:p>
-            <w:pPr>
-              <w:spacing w:after="0" w:before="0"/>
-            </w:pPr>
-            <w:r>
-              <w:rPr>
-                <w:rFonts w:ascii="Aptos" w:hAnsi="Aptos"/>
-                <w:color w:val="334155"/>
-                <w:sz w:val="16"/>
-              </w:rPr>
-              <w:t>Test Suite Count</w:t>
-            </w:r>
-          </w:p>
-        </w:tc>
-        <w:tc>
-          <w:tcPr>
-            <w:tcW w:type="dxa" w:w="2340"/>
-            <w:vAlign w:val="center"/>
-            <w:tcMar>
-              <w:top w:w="90" w:type="dxa"/>
-              <w:start w:w="110" w:type="dxa"/>
-              <w:bottom w:w="90" w:type="dxa"/>
-              <w:end w:w="110" w:type="dxa"/>
-            </w:tcMar>
-          </w:tcPr>
-          <w:p>
-            <w:pPr>
-              <w:spacing w:after="0" w:before="0"/>
-            </w:pPr>
-            <w:r>
-              <w:rPr>
-                <w:rFonts w:ascii="Aptos" w:hAnsi="Aptos"/>
-                <w:color w:val="334155"/>
-                <w:sz w:val="16"/>
-              </w:rPr>
-              <w:t>90 tests passing</w:t>
-            </w:r>
-          </w:p>
-        </w:tc>
-        <w:tc>
-          <w:tcPr>
-            <w:tcW w:type="dxa" w:w="2340"/>
-            <w:vAlign w:val="center"/>
-            <w:tcMar>
-              <w:top w:w="90" w:type="dxa"/>
-              <w:start w:w="110" w:type="dxa"/>
-              <w:bottom w:w="90" w:type="dxa"/>
-              <w:end w:w="110" w:type="dxa"/>
-            </w:tcMar>
-          </w:tcPr>
-          <w:p>
-            <w:pPr>
-              <w:spacing w:after="0" w:before="0"/>
-            </w:pPr>
-            <w:r>
-              <w:rPr>
-                <w:rFonts w:ascii="Aptos" w:hAnsi="Aptos"/>
-                <w:color w:val="334155"/>
-                <w:sz w:val="16"/>
-              </w:rPr>
-              <w:t>94 tests passing</w:t>
-            </w:r>
-          </w:p>
-        </w:tc>
-        <w:tc>
-          <w:tcPr>
-            <w:tcW w:type="dxa" w:w="2340"/>
-            <w:vAlign w:val="center"/>
-            <w:tcMar>
-              <w:top w:w="90" w:type="dxa"/>
-              <w:start w:w="110" w:type="dxa"/>
-              <w:bottom w:w="90" w:type="dxa"/>
-              <w:end w:w="110" w:type="dxa"/>
-            </w:tcMar>
-          </w:tcPr>
-          <w:p>
-            <w:pPr>
-              <w:spacing w:after="0" w:before="0"/>
-            </w:pPr>
-            <w:r>
-              <w:rPr>
-                <w:rFonts w:ascii="Aptos" w:hAnsi="Aptos"/>
-                <w:color w:val="334155"/>
-                <w:sz w:val="16"/>
-              </w:rPr>
-              <w:t>Added tests/test_assistant.py (4 new test cases).</w:t>
-            </w:r>
-          </w:p>
-        </w:tc>
-      </w:tr>
-      <w:tr>
-        <w:tc>
-          <w:tcPr>
-            <w:tcW w:type="dxa" w:w="2340"/>
-            <w:vAlign w:val="center"/>
-            <w:tcMar>
-              <w:top w:w="90" w:type="dxa"/>
-              <w:start w:w="110" w:type="dxa"/>
-              <w:bottom w:w="90" w:type="dxa"/>
-              <w:end w:w="110" w:type="dxa"/>
-            </w:tcMar>
-            <w:shd w:fill="F8FAFC"/>
-          </w:tcPr>
-          <w:p>
-            <w:pPr>
-              <w:spacing w:after="0" w:before="0"/>
-            </w:pPr>
-            <w:r>
-              <w:rPr>
-                <w:rFonts w:ascii="Aptos" w:hAnsi="Aptos"/>
-                <w:color w:val="334155"/>
-                <w:sz w:val="16"/>
-              </w:rPr>
-              <w:t>Conversational Co-Pilot</w:t>
-            </w:r>
-          </w:p>
-        </w:tc>
-        <w:tc>
-          <w:tcPr>
-            <w:tcW w:type="dxa" w:w="2340"/>
-            <w:vAlign w:val="center"/>
-            <w:tcMar>
-              <w:top w:w="90" w:type="dxa"/>
-              <w:start w:w="110" w:type="dxa"/>
-              <w:bottom w:w="90" w:type="dxa"/>
-              <w:end w:w="110" w:type="dxa"/>
-            </w:tcMar>
-            <w:shd w:fill="F8FAFC"/>
-          </w:tcPr>
-          <w:p>
-            <w:pPr>
-              <w:spacing w:after="0" w:before="0"/>
-            </w:pPr>
-            <w:r>
-              <w:rPr>
-                <w:rFonts w:ascii="Aptos" w:hAnsi="Aptos"/>
-                <w:color w:val="334155"/>
-                <w:sz w:val="16"/>
-              </w:rPr>
-              <w:t>Omitted / Not documented</w:t>
-            </w:r>
-          </w:p>
-        </w:tc>
-        <w:tc>
-          <w:tcPr>
-            <w:tcW w:type="dxa" w:w="2340"/>
-            <w:vAlign w:val="center"/>
-            <w:tcMar>
-              <w:top w:w="90" w:type="dxa"/>
-              <w:start w:w="110" w:type="dxa"/>
-              <w:bottom w:w="90" w:type="dxa"/>
-              <w:end w:w="110" w:type="dxa"/>
-            </w:tcMar>
-            <w:shd w:fill="F8FAFC"/>
-          </w:tcPr>
-          <w:p>
-            <w:pPr>
-              <w:spacing w:after="0" w:before="0"/>
-            </w:pPr>
-            <w:r>
-              <w:rPr>
-                <w:rFonts w:ascii="Aptos" w:hAnsi="Aptos"/>
-                <w:color w:val="334155"/>
-                <w:sz w:val="16"/>
-              </w:rPr>
-              <w:t>Implemented in agent/assistant.py</w:t>
-            </w:r>
-          </w:p>
-        </w:tc>
-        <w:tc>
-          <w:tcPr>
-            <w:tcW w:type="dxa" w:w="2340"/>
-            <w:vAlign w:val="center"/>
-            <w:tcMar>
-              <w:top w:w="90" w:type="dxa"/>
-              <w:start w:w="110" w:type="dxa"/>
-              <w:bottom w:w="90" w:type="dxa"/>
-              <w:end w:w="110" w:type="dxa"/>
-            </w:tcMar>
-            <w:shd w:fill="F8FAFC"/>
-          </w:tcPr>
-          <w:p>
-            <w:pPr>
-              <w:spacing w:after="0" w:before="0"/>
-            </w:pPr>
-            <w:r>
-              <w:rPr>
-                <w:rFonts w:ascii="Aptos" w:hAnsi="Aptos"/>
-                <w:color w:val="334155"/>
-                <w:sz w:val="16"/>
-              </w:rPr>
-              <w:t>Added Conversational Assistant &amp; Anomaly Auditor evidence.</w:t>
-            </w:r>
-          </w:p>
-        </w:tc>
-      </w:tr>
-      <w:tr>
-        <w:tc>
-          <w:tcPr>
-            <w:tcW w:type="dxa" w:w="2340"/>
-            <w:vAlign w:val="center"/>
-            <w:tcMar>
-              <w:top w:w="90" w:type="dxa"/>
-              <w:start w:w="110" w:type="dxa"/>
-              <w:bottom w:w="90" w:type="dxa"/>
-              <w:end w:w="110" w:type="dxa"/>
-            </w:tcMar>
-          </w:tcPr>
-          <w:p>
-            <w:pPr>
-              <w:spacing w:after="0" w:before="0"/>
-            </w:pPr>
-            <w:r>
-              <w:rPr>
-                <w:rFonts w:ascii="Aptos" w:hAnsi="Aptos"/>
-                <w:color w:val="334155"/>
-                <w:sz w:val="16"/>
-              </w:rPr>
-              <w:t>Lexicon Comparators</w:t>
-            </w:r>
-          </w:p>
-        </w:tc>
-        <w:tc>
-          <w:tcPr>
-            <w:tcW w:type="dxa" w:w="2340"/>
-            <w:vAlign w:val="center"/>
-            <w:tcMar>
-              <w:top w:w="90" w:type="dxa"/>
-              <w:start w:w="110" w:type="dxa"/>
-              <w:bottom w:w="90" w:type="dxa"/>
-              <w:end w:w="110" w:type="dxa"/>
-            </w:tcMar>
-          </w:tcPr>
-          <w:p>
-            <w:pPr>
-              <w:spacing w:after="0" w:before="0"/>
-            </w:pPr>
-            <w:r>
-              <w:rPr>
-                <w:rFonts w:ascii="Aptos" w:hAnsi="Aptos"/>
-                <w:color w:val="334155"/>
-                <w:sz w:val="16"/>
-              </w:rPr>
-              <w:t>Word-only ('under', 'less than')</w:t>
-            </w:r>
-          </w:p>
-        </w:tc>
-        <w:tc>
-          <w:tcPr>
-            <w:tcW w:type="dxa" w:w="2340"/>
-            <w:vAlign w:val="center"/>
-            <w:tcMar>
-              <w:top w:w="90" w:type="dxa"/>
-              <w:start w:w="110" w:type="dxa"/>
-              <w:bottom w:w="90" w:type="dxa"/>
-              <w:end w:w="110" w:type="dxa"/>
-            </w:tcMar>
-          </w:tcPr>
-          <w:p>
-            <w:pPr>
-              <w:spacing w:after="0" w:before="0"/>
-            </w:pPr>
-            <w:r>
-              <w:rPr>
-                <w:rFonts w:ascii="Aptos" w:hAnsi="Aptos"/>
-                <w:color w:val="334155"/>
-                <w:sz w:val="16"/>
-              </w:rPr>
-              <w:t>Symbolic (&lt;, &lt;=, &gt;, &gt;=, =, ==)</w:t>
-            </w:r>
-          </w:p>
-        </w:tc>
-        <w:tc>
-          <w:tcPr>
-            <w:tcW w:type="dxa" w:w="2340"/>
-            <w:vAlign w:val="center"/>
-            <w:tcMar>
-              <w:top w:w="90" w:type="dxa"/>
-              <w:start w:w="110" w:type="dxa"/>
-              <w:bottom w:w="90" w:type="dxa"/>
-              <w:end w:w="110" w:type="dxa"/>
-            </w:tcMar>
-          </w:tcPr>
-          <w:p>
-            <w:pPr>
-              <w:spacing w:after="0" w:before="0"/>
-            </w:pPr>
-            <w:r>
-              <w:rPr>
-                <w:rFonts w:ascii="Aptos" w:hAnsi="Aptos"/>
-                <w:color w:val="334155"/>
-                <w:sz w:val="16"/>
-              </w:rPr>
-              <w:t>Updated parser documentation to reflect symbolic operator support.</w:t>
-            </w:r>
-          </w:p>
-        </w:tc>
-      </w:tr>
-      <w:tr>
-        <w:tc>
-          <w:tcPr>
-            <w:tcW w:type="dxa" w:w="2340"/>
-            <w:vAlign w:val="center"/>
-            <w:tcMar>
-              <w:top w:w="90" w:type="dxa"/>
-              <w:start w:w="110" w:type="dxa"/>
-              <w:bottom w:w="90" w:type="dxa"/>
-              <w:end w:w="110" w:type="dxa"/>
-            </w:tcMar>
-            <w:shd w:fill="F8FAFC"/>
-          </w:tcPr>
-          <w:p>
-            <w:pPr>
-              <w:spacing w:after="0" w:before="0"/>
-            </w:pPr>
-            <w:r>
-              <w:rPr>
-                <w:rFonts w:ascii="Aptos" w:hAnsi="Aptos"/>
-                <w:color w:val="334155"/>
-                <w:sz w:val="16"/>
-              </w:rPr>
-              <w:t>System Source Map</w:t>
-            </w:r>
-          </w:p>
-        </w:tc>
-        <w:tc>
-          <w:tcPr>
-            <w:tcW w:type="dxa" w:w="2340"/>
-            <w:vAlign w:val="center"/>
-            <w:tcMar>
-              <w:top w:w="90" w:type="dxa"/>
-              <w:start w:w="110" w:type="dxa"/>
-              <w:bottom w:w="90" w:type="dxa"/>
-              <w:end w:w="110" w:type="dxa"/>
-            </w:tcMar>
-            <w:shd w:fill="F8FAFC"/>
-          </w:tcPr>
-          <w:p>
-            <w:pPr>
-              <w:spacing w:after="0" w:before="0"/>
-            </w:pPr>
-            <w:r>
-              <w:rPr>
-                <w:rFonts w:ascii="Aptos" w:hAnsi="Aptos"/>
-                <w:color w:val="334155"/>
-                <w:sz w:val="16"/>
-              </w:rPr>
-              <w:t>7 core modules</w:t>
-            </w:r>
-          </w:p>
-        </w:tc>
-        <w:tc>
-          <w:tcPr>
-            <w:tcW w:type="dxa" w:w="2340"/>
-            <w:vAlign w:val="center"/>
-            <w:tcMar>
-              <w:top w:w="90" w:type="dxa"/>
-              <w:start w:w="110" w:type="dxa"/>
-              <w:bottom w:w="90" w:type="dxa"/>
-              <w:end w:w="110" w:type="dxa"/>
-            </w:tcMar>
-            <w:shd w:fill="F8FAFC"/>
-          </w:tcPr>
-          <w:p>
-            <w:pPr>
-              <w:spacing w:after="0" w:before="0"/>
-            </w:pPr>
-            <w:r>
-              <w:rPr>
-                <w:rFonts w:ascii="Aptos" w:hAnsi="Aptos"/>
-                <w:color w:val="334155"/>
-                <w:sz w:val="16"/>
-              </w:rPr>
-              <w:t>8 core modules</w:t>
-            </w:r>
-          </w:p>
-        </w:tc>
-        <w:tc>
-          <w:tcPr>
-            <w:tcW w:type="dxa" w:w="2340"/>
-            <w:vAlign w:val="center"/>
-            <w:tcMar>
-              <w:top w:w="90" w:type="dxa"/>
-              <w:start w:w="110" w:type="dxa"/>
-              <w:bottom w:w="90" w:type="dxa"/>
-              <w:end w:w="110" w:type="dxa"/>
-            </w:tcMar>
-            <w:shd w:fill="F8FAFC"/>
-          </w:tcPr>
-          <w:p>
-            <w:pPr>
-              <w:spacing w:after="0" w:before="0"/>
-            </w:pPr>
-            <w:r>
-              <w:rPr>
-                <w:rFonts w:ascii="Aptos" w:hAnsi="Aptos"/>
-                <w:color w:val="334155"/>
-                <w:sz w:val="16"/>
-              </w:rPr>
-              <w:t>Included agent/assistant.py and new API endpoints in source index.</w:t>
-            </w:r>
-          </w:p>
-        </w:tc>
-      </w:tr>
-    </w:tbl>
-    <w:p>
-      <w:pPr>
-        <w:spacing w:before="40" w:after="80"/>
-      </w:pPr>
-    </w:p>
-    <w:p>
-      <w:pPr>
-        <w:pStyle w:val="Heading1"/>
-        <w:keepNext/>
-      </w:pPr>
-      <w:r>
-        <w:t>3. System Architecture &amp; Component Roles</w:t>
+        <w:t>2. System Architecture &amp; Component Roles</w:t>
       </w:r>
     </w:p>
     <w:p>
@@ -4531,7 +3747,7 @@
         <w:keepNext/>
       </w:pPr>
       <w:r>
-        <w:t>4. Execution Scenario Register (EE-01 to EE-07)</w:t>
+        <w:t>3. Execution Scenario Register (EE-01 to EE-07)</w:t>
       </w:r>
     </w:p>
     <w:p>
@@ -5852,7 +5068,7 @@
         <w:keepNext/>
       </w:pPr>
       <w:r>
-        <w:t>5. Detailed Execution Records</w:t>
+        <w:t>4. Detailed Execution Records</w:t>
       </w:r>
     </w:p>
     <w:p>
@@ -10157,7 +9373,7 @@
         <w:keepNext/>
       </w:pPr>
       <w:r>
-        <w:t>6. Live On-Chain Transaction Evidence &amp; BaseScan Verification</w:t>
+        <w:t>5. Live On-Chain Transaction Evidence &amp; BaseScan Verification</w:t>
       </w:r>
     </w:p>
     <w:p>
@@ -11617,7 +10833,7 @@
         <w:keepNext/>
       </w:pPr>
       <w:r>
-        <w:t>7. Automated Test Suite Evidence (EV-TEST-01)</w:t>
+        <w:t>6. Automated Test Suite Evidence (EV-TEST-01)</w:t>
       </w:r>
     </w:p>
     <w:p>
@@ -11954,7 +11170,7 @@
         <w:keepNext/>
       </w:pPr>
       <w:r>
-        <w:t>8. Demo Video &amp; Evidence Walkthrough (EV-VIDEO-01)</w:t>
+        <w:t>7. Demo Video &amp; Evidence Walkthrough (EV-VIDEO-01)</w:t>
       </w:r>
     </w:p>
     <w:p>
@@ -12946,7 +12162,7 @@
         <w:keepNext/>
       </w:pPr>
       <w:r>
-        <w:t>9. Findings &amp; Recommended Remediation Register</w:t>
+        <w:t>8. Findings &amp; Recommended Remediation Register</w:t>
       </w:r>
     </w:p>
     <w:p>
@@ -13739,7 +12955,7 @@
         <w:keepNext/>
       </w:pPr>
       <w:r>
-        <w:t>10. Reproduction Steps</w:t>
+        <w:t>9. Reproduction Steps</w:t>
       </w:r>
     </w:p>
     <w:p>
@@ -13963,7 +13179,7 @@
         <w:keepNext/>
       </w:pPr>
       <w:r>
-        <w:t>11. Appendices &amp; Supporting Files</w:t>
+        <w:t>10. Appendices &amp; Supporting Files</w:t>
       </w:r>
     </w:p>
     <w:p>

</xml_diff>